<commit_message>
Complete assignment 2 with tests
</commit_message>
<xml_diff>
--- a/AI Usage Declaration.docx
+++ b/AI Usage Declaration.docx
@@ -2,7 +2,7 @@
 <file path=word/document.xml><?xml version="1.0" encoding="utf-8"?>
 <w:document xmlns:o="urn:schemas-microsoft-com:office:office" xmlns:r="http://schemas.openxmlformats.org/officeDocument/2006/relationships" xmlns:v="urn:schemas-microsoft-com:vml" xmlns:w="http://schemas.openxmlformats.org/wordprocessingml/2006/main" xmlns:w10="urn:schemas-microsoft-com:office:word" xmlns:wp="http://schemas.openxmlformats.org/drawingml/2006/wordprocessingDrawing" xmlns:wps="http://schemas.microsoft.com/office/word/2010/wordprocessingShape" xmlns:wpg="http://schemas.microsoft.com/office/word/2010/wordprocessingGroup" xmlns:mc="http://schemas.openxmlformats.org/markup-compatibility/2006" xmlns:wp14="http://schemas.microsoft.com/office/word/2010/wordprocessingDrawing" xmlns:w14="http://schemas.microsoft.com/office/word/2010/wordml" xmlns:w15="http://schemas.microsoft.com/office/word/2012/wordml" mc:Ignorable="w14 wp14 w15">
   <w:body>
-    <w:p>
+    <w:p xmlns:wp14="http://schemas.microsoft.com/office/word/2010/wordml" wp14:textId="77777777">
       <w:pPr>
         <w:pStyle w:val="Normal"/>
         <w:rPr>
@@ -22,7 +22,7 @@
         <w:t>AI Usage Declaration</w:t>
       </w:r>
     </w:p>
-    <w:p>
+    <w:p xmlns:wp14="http://schemas.microsoft.com/office/word/2010/wordml" wp14:textId="77777777">
       <w:pPr>
         <w:pStyle w:val="Heading3"/>
         <w:spacing w:before="281" w:after="281"/>
@@ -39,7 +39,7 @@
         <w:t>AI Usage Declaration Submission Instructions</w:t>
       </w:r>
     </w:p>
-    <w:p>
+    <w:p xmlns:wp14="http://schemas.microsoft.com/office/word/2010/wordml" wp14:textId="77777777">
       <w:pPr>
         <w:pStyle w:val="Normal"/>
         <w:rPr/>
@@ -47,7 +47,13 @@
       <w:r>
         <w:rPr/>
         <w:t xml:space="preserve">When completing your assignment, you must download and fill out the "AI Usage Declaration" form for each assignment where AI use is permitted. </w:t>
+      </w:r>
+      <w:r>
+        <w:rPr/>
         <w:br/>
+      </w:r>
+      <w:r>
+        <w:rPr/>
         <w:t>Once completed, convert the form to a PDF and save it as “</w:t>
       </w:r>
       <w:r>
@@ -60,7 +66,13 @@
       <w:r>
         <w:rPr/>
         <w:t>. Submit this PDF along with your assignment.</w:t>
+      </w:r>
+      <w:r>
+        <w:rPr/>
         <w:br/>
+      </w:r>
+      <w:r>
+        <w:rPr/>
         <w:t xml:space="preserve">This declaration is </w:t>
       </w:r>
       <w:r>
@@ -83,22 +95,22 @@
         <w:t xml:space="preserve"> and failure to submit it will result in a zero for the assignment. Ensure all information provided is accurate and aligns with the academic integrity guidelines.</w:t>
       </w:r>
     </w:p>
-    <w:p>
-      <w:pPr>
-        <w:pStyle w:val="Normal"/>
-        <w:rPr>
-          <w:b/>
-          <w:bCs/>
-        </w:rPr>
-      </w:pPr>
-      <w:r>
-        <w:rPr>
-          <w:b/>
-          <w:bCs/>
-        </w:rPr>
-      </w:r>
-    </w:p>
-    <w:p>
+    <w:p xmlns:wp14="http://schemas.microsoft.com/office/word/2010/wordml" wp14:textId="77777777">
+      <w:pPr>
+        <w:pStyle w:val="Normal"/>
+        <w:rPr>
+          <w:b/>
+          <w:bCs/>
+        </w:rPr>
+      </w:pPr>
+      <w:r>
+        <w:rPr>
+          <w:b/>
+          <w:bCs/>
+        </w:rPr>
+      </w:r>
+    </w:p>
+    <w:p xmlns:wp14="http://schemas.microsoft.com/office/word/2010/wordml" wp14:textId="77777777">
       <w:pPr>
         <w:pStyle w:val="Normal"/>
         <w:rPr/>
@@ -111,7 +123,7 @@
         <w:t>Student Information</w:t>
       </w:r>
     </w:p>
-    <w:p>
+    <w:p xmlns:wp14="http://schemas.microsoft.com/office/word/2010/wordml" wp14:textId="6B15EFDE">
       <w:pPr>
         <w:pStyle w:val="Normal"/>
         <w:numPr>
@@ -122,10 +134,10 @@
       </w:pPr>
       <w:r>
         <w:rPr/>
-        <w:t>Name: _____________________________________</w:t>
-      </w:r>
-    </w:p>
-    <w:p>
+        <w:t>Name: ______Blossom Babalola____</w:t>
+      </w:r>
+    </w:p>
+    <w:p xmlns:wp14="http://schemas.microsoft.com/office/word/2010/wordml" wp14:textId="5BCDAC8F">
       <w:pPr>
         <w:pStyle w:val="Normal"/>
         <w:numPr>
@@ -136,10 +148,10 @@
       </w:pPr>
       <w:r>
         <w:rPr/>
-        <w:t>Student ID: __________________________________</w:t>
-      </w:r>
-    </w:p>
-    <w:p>
+        <w:t>Student ID: ____101606071_____</w:t>
+      </w:r>
+    </w:p>
+    <w:p xmlns:wp14="http://schemas.microsoft.com/office/word/2010/wordml" wp14:textId="3C3671D3">
       <w:pPr>
         <w:pStyle w:val="Normal"/>
         <w:numPr>
@@ -150,10 +162,10 @@
       </w:pPr>
       <w:r>
         <w:rPr/>
-        <w:t>Course Code: __________________________________</w:t>
-      </w:r>
-    </w:p>
-    <w:p>
+        <w:t>Course Code: _ COMP 2152</w:t>
+      </w:r>
+    </w:p>
+    <w:p xmlns:wp14="http://schemas.microsoft.com/office/word/2010/wordml" wp14:textId="77777777">
       <w:pPr>
         <w:pStyle w:val="Normal"/>
         <w:rPr/>
@@ -166,7 +178,7 @@
         <w:t>Assessment Information</w:t>
       </w:r>
     </w:p>
-    <w:p>
+    <w:p xmlns:wp14="http://schemas.microsoft.com/office/word/2010/wordml" wp14:textId="03E5F866">
       <w:pPr>
         <w:pStyle w:val="Normal"/>
         <w:numPr>
@@ -177,10 +189,10 @@
       </w:pPr>
       <w:r>
         <w:rPr/>
-        <w:t>Assessment Name: __________________________________</w:t>
-      </w:r>
-    </w:p>
-    <w:p>
+        <w:t>Assessment Name: Assignment 2</w:t>
+      </w:r>
+    </w:p>
+    <w:p xmlns:wp14="http://schemas.microsoft.com/office/word/2010/wordml" wp14:textId="2CDDBD86">
       <w:pPr>
         <w:pStyle w:val="Normal"/>
         <w:numPr>
@@ -191,25 +203,25 @@
       </w:pPr>
       <w:r>
         <w:rPr/>
-        <w:t>Submission Date: _______________________________________</w:t>
-      </w:r>
-    </w:p>
-    <w:p>
-      <w:pPr>
-        <w:pStyle w:val="Normal"/>
-        <w:rPr>
-          <w:b/>
-          <w:bCs/>
-        </w:rPr>
-      </w:pPr>
-      <w:r>
-        <w:rPr>
-          <w:b/>
-          <w:bCs/>
-        </w:rPr>
-      </w:r>
-    </w:p>
-    <w:p>
+        <w:t>Submission Date: March 29</w:t>
+      </w:r>
+    </w:p>
+    <w:p xmlns:wp14="http://schemas.microsoft.com/office/word/2010/wordml" wp14:textId="77777777">
+      <w:pPr>
+        <w:pStyle w:val="Normal"/>
+        <w:rPr>
+          <w:b/>
+          <w:bCs/>
+        </w:rPr>
+      </w:pPr>
+      <w:r>
+        <w:rPr>
+          <w:b/>
+          <w:bCs/>
+        </w:rPr>
+      </w:r>
+    </w:p>
+    <w:p xmlns:wp14="http://schemas.microsoft.com/office/word/2010/wordml" wp14:textId="77777777">
       <w:pPr>
         <w:pStyle w:val="Normal"/>
         <w:rPr>
@@ -227,7 +239,7 @@
         <w:t>(Add * for those applicable)</w:t>
       </w:r>
     </w:p>
-    <w:p>
+    <w:p xmlns:wp14="http://schemas.microsoft.com/office/word/2010/wordml" wp14:textId="77777777">
       <w:pPr>
         <w:pStyle w:val="Normal"/>
         <w:rPr>
@@ -245,7 +257,7 @@
         <w:t xml:space="preserve">AI Tool(s) Used: </w:t>
       </w:r>
     </w:p>
-    <w:p>
+    <w:p xmlns:wp14="http://schemas.microsoft.com/office/word/2010/wordml" wp14:textId="77777777">
       <w:pPr>
         <w:pStyle w:val="ListParagraph"/>
         <w:numPr>
@@ -265,7 +277,7 @@
         <w:t>ChatGPT</w:t>
       </w:r>
     </w:p>
-    <w:p>
+    <w:p xmlns:wp14="http://schemas.microsoft.com/office/word/2010/wordml" wp14:textId="77777777">
       <w:pPr>
         <w:pStyle w:val="ListParagraph"/>
         <w:numPr>
@@ -285,7 +297,7 @@
         <w:t>Copilot</w:t>
       </w:r>
     </w:p>
-    <w:p>
+    <w:p xmlns:wp14="http://schemas.microsoft.com/office/word/2010/wordml" wp14:textId="77777777">
       <w:pPr>
         <w:pStyle w:val="ListParagraph"/>
         <w:numPr>
@@ -305,7 +317,96 @@
         <w:t>DALL-E</w:t>
       </w:r>
     </w:p>
-    <w:p>
+    <w:p xmlns:wp14="http://schemas.microsoft.com/office/word/2010/wordml" wp14:textId="07FC8B10">
+      <w:pPr>
+        <w:pStyle w:val="ListParagraph"/>
+        <w:numPr>
+          <w:ilvl w:val="0"/>
+          <w:numId w:val="1"/>
+        </w:numPr>
+        <w:spacing w:before="0" w:after="0"/>
+        <w:contextualSpacing w:val="1"/>
+        <w:rPr>
+          <w:rFonts w:eastAsia="Aptos" w:cs="Aptos"/>
+          <w:b w:val="1"/>
+          <w:bCs w:val="1"/>
+        </w:rPr>
+      </w:pPr>
+      <w:r>
+        <w:rPr>
+          <w:rFonts w:eastAsia="Aptos" w:cs="Aptos"/>
+        </w:rPr>
+        <w:t xml:space="preserve">Other: [Specify] </w:t>
+      </w:r>
+      <w:r>
+        <w:rPr>
+          <w:rFonts w:eastAsia="Aptos" w:cs="Aptos"/>
+          <w:b w:val="1"/>
+          <w:bCs w:val="1"/>
+        </w:rPr>
+        <w:t>visual studio code inline suggestion</w:t>
+      </w:r>
+    </w:p>
+    <w:p xmlns:wp14="http://schemas.microsoft.com/office/word/2010/wordml" wp14:textId="77777777">
+      <w:pPr>
+        <w:pStyle w:val="Normal"/>
+        <w:rPr/>
+      </w:pPr>
+      <w:r>
+        <w:rPr/>
+      </w:r>
+    </w:p>
+    <w:p xmlns:wp14="http://schemas.microsoft.com/office/word/2010/wordml" wp14:textId="77777777">
+      <w:pPr>
+        <w:pStyle w:val="Normal"/>
+        <w:rPr/>
+      </w:pPr>
+      <w:r>
+        <w:rPr/>
+      </w:r>
+    </w:p>
+    <w:p xmlns:wp14="http://schemas.microsoft.com/office/word/2010/wordml" wp14:textId="77777777">
+      <w:pPr>
+        <w:pStyle w:val="Normal"/>
+        <w:rPr/>
+      </w:pPr>
+      <w:r>
+        <w:rPr/>
+        <w:t>(form continues on next page)</w:t>
+      </w:r>
+      <w:r>
+        <w:br w:type="page"/>
+      </w:r>
+    </w:p>
+    <w:p xmlns:wp14="http://schemas.microsoft.com/office/word/2010/wordml" wp14:textId="77777777">
+      <w:pPr>
+        <w:pStyle w:val="Heading4"/>
+        <w:spacing w:before="319" w:after="319"/>
+        <w:rPr/>
+      </w:pPr>
+      <w:r>
+        <w:rPr>
+          <w:rFonts w:eastAsia="Aptos" w:cs="Aptos"/>
+          <w:b/>
+          <w:bCs/>
+        </w:rPr>
+        <w:t>Purpose of AI Usage:</w:t>
+      </w:r>
+    </w:p>
+    <w:p xmlns:wp14="http://schemas.microsoft.com/office/word/2010/wordml" wp14:textId="77777777">
+      <w:pPr>
+        <w:pStyle w:val="Normal"/>
+        <w:spacing w:before="240" w:after="240"/>
+        <w:rPr/>
+      </w:pPr>
+      <w:r>
+        <w:rPr>
+          <w:rFonts w:eastAsia="Aptos" w:cs="Aptos"/>
+        </w:rPr>
+        <w:t>(Select the primary purposes for which AI was used in this assessment)</w:t>
+      </w:r>
+    </w:p>
+    <w:p xmlns:wp14="http://schemas.microsoft.com/office/word/2010/wordml" wp14:textId="77777777">
       <w:pPr>
         <w:pStyle w:val="ListParagraph"/>
         <w:numPr>
@@ -322,69 +423,10 @@
         <w:rPr>
           <w:rFonts w:eastAsia="Aptos" w:cs="Aptos"/>
         </w:rPr>
-        <w:t>Other: [Specify]</w:t>
-      </w:r>
-    </w:p>
-    <w:p>
-      <w:pPr>
-        <w:pStyle w:val="Normal"/>
-        <w:rPr/>
-      </w:pPr>
-      <w:r>
-        <w:rPr/>
-      </w:r>
-    </w:p>
-    <w:p>
-      <w:pPr>
-        <w:pStyle w:val="Normal"/>
-        <w:rPr/>
-      </w:pPr>
-      <w:r>
-        <w:rPr/>
-      </w:r>
-    </w:p>
-    <w:p>
-      <w:pPr>
-        <w:pStyle w:val="Normal"/>
-        <w:rPr/>
-      </w:pPr>
-      <w:r>
-        <w:rPr/>
-        <w:t>(form continues on next page)</w:t>
-      </w:r>
-      <w:r>
-        <w:br w:type="page"/>
-      </w:r>
-    </w:p>
-    <w:p>
-      <w:pPr>
-        <w:pStyle w:val="Heading4"/>
-        <w:spacing w:before="319" w:after="319"/>
-        <w:rPr/>
-      </w:pPr>
-      <w:r>
-        <w:rPr>
-          <w:rFonts w:eastAsia="Aptos" w:cs="Aptos"/>
-          <w:b/>
-          <w:bCs/>
-        </w:rPr>
-        <w:t>Purpose of AI Usage:</w:t>
-      </w:r>
-    </w:p>
-    <w:p>
-      <w:pPr>
-        <w:pStyle w:val="Normal"/>
-        <w:spacing w:before="240" w:after="240"/>
-        <w:rPr/>
-      </w:pPr>
-      <w:r>
-        <w:rPr>
-          <w:rFonts w:eastAsia="Aptos" w:cs="Aptos"/>
-        </w:rPr>
-        <w:t>(Select the primary purposes for which AI was used in this assessment)</w:t>
-      </w:r>
-    </w:p>
-    <w:p>
+        <w:t>Idea Generation</w:t>
+      </w:r>
+    </w:p>
+    <w:p xmlns:wp14="http://schemas.microsoft.com/office/word/2010/wordml" wp14:textId="77777777">
       <w:pPr>
         <w:pStyle w:val="ListParagraph"/>
         <w:numPr>
@@ -401,10 +443,10 @@
         <w:rPr>
           <w:rFonts w:eastAsia="Aptos" w:cs="Aptos"/>
         </w:rPr>
-        <w:t>Idea Generation</w:t>
-      </w:r>
-    </w:p>
-    <w:p>
+        <w:t>Writing Assistance</w:t>
+      </w:r>
+    </w:p>
+    <w:p xmlns:wp14="http://schemas.microsoft.com/office/word/2010/wordml" wp14:textId="77777777">
       <w:pPr>
         <w:pStyle w:val="ListParagraph"/>
         <w:numPr>
@@ -421,10 +463,10 @@
         <w:rPr>
           <w:rFonts w:eastAsia="Aptos" w:cs="Aptos"/>
         </w:rPr>
-        <w:t>Writing Assistance</w:t>
-      </w:r>
-    </w:p>
-    <w:p>
+        <w:t>Image Creation</w:t>
+      </w:r>
+    </w:p>
+    <w:p xmlns:wp14="http://schemas.microsoft.com/office/word/2010/wordml" wp14:textId="77777777">
       <w:pPr>
         <w:pStyle w:val="ListParagraph"/>
         <w:numPr>
@@ -441,10 +483,10 @@
         <w:rPr>
           <w:rFonts w:eastAsia="Aptos" w:cs="Aptos"/>
         </w:rPr>
-        <w:t>Image Creation</w:t>
-      </w:r>
-    </w:p>
-    <w:p>
+        <w:t>Coding/Programming</w:t>
+      </w:r>
+    </w:p>
+    <w:p xmlns:wp14="http://schemas.microsoft.com/office/word/2010/wordml" wp14:textId="77777777">
       <w:pPr>
         <w:pStyle w:val="ListParagraph"/>
         <w:numPr>
@@ -461,10 +503,88 @@
         <w:rPr>
           <w:rFonts w:eastAsia="Aptos" w:cs="Aptos"/>
         </w:rPr>
-        <w:t>Coding/Programming</w:t>
-      </w:r>
-    </w:p>
-    <w:p>
+        <w:t>Language Refinement</w:t>
+      </w:r>
+    </w:p>
+    <w:p xmlns:wp14="http://schemas.microsoft.com/office/word/2010/wordml" wp14:textId="3BEA6C26">
+      <w:pPr>
+        <w:pStyle w:val="ListParagraph"/>
+        <w:numPr>
+          <w:ilvl w:val="0"/>
+          <w:numId w:val="1"/>
+        </w:numPr>
+        <w:spacing w:before="0" w:after="0"/>
+        <w:contextualSpacing w:val="1"/>
+        <w:rPr>
+          <w:rFonts w:ascii="Aptos" w:hAnsi="Aptos" w:eastAsia="Aptos" w:cs="Aptos"/>
+          <w:b w:val="1"/>
+          <w:bCs w:val="1"/>
+        </w:rPr>
+      </w:pPr>
+      <w:r>
+        <w:rPr>
+          <w:rFonts w:eastAsia="Aptos" w:cs="Aptos"/>
+        </w:rPr>
+        <w:t xml:space="preserve">Other: [Specify] </w:t>
+      </w:r>
+      <w:r>
+        <w:rPr>
+          <w:rFonts w:eastAsia="Aptos" w:cs="Aptos"/>
+          <w:b w:val="1"/>
+          <w:bCs w:val="1"/>
+        </w:rPr>
+        <w:t>syntax correction</w:t>
+      </w:r>
+    </w:p>
+    <w:p xmlns:wp14="http://schemas.microsoft.com/office/word/2010/wordml" wp14:textId="77777777">
+      <w:pPr>
+        <w:pStyle w:val="Normal"/>
+        <w:spacing w:before="0" w:after="0"/>
+        <w:rPr>
+          <w:rFonts w:ascii="Aptos" w:hAnsi="Aptos" w:eastAsia="Aptos" w:cs="Aptos"/>
+        </w:rPr>
+      </w:pPr>
+      <w:r>
+        <w:rPr>
+          <w:rFonts w:eastAsia="Aptos" w:cs="Aptos"/>
+        </w:rPr>
+      </w:r>
+    </w:p>
+    <w:p xmlns:wp14="http://schemas.microsoft.com/office/word/2010/wordml" wp14:textId="77777777">
+      <w:pPr>
+        <w:pStyle w:val="Heading4"/>
+        <w:spacing w:before="319" w:after="319"/>
+        <w:rPr/>
+      </w:pPr>
+      <w:r>
+        <w:rPr>
+          <w:rFonts w:eastAsia="Aptos" w:cs="Aptos"/>
+          <w:b/>
+          <w:bCs/>
+        </w:rPr>
+        <w:t>Details of AI-Generated Content:</w:t>
+      </w:r>
+    </w:p>
+    <w:p xmlns:wp14="http://schemas.microsoft.com/office/word/2010/wordml" wp14:textId="77777777">
+      <w:pPr>
+        <w:pStyle w:val="Normal"/>
+        <w:spacing w:before="240" w:after="240"/>
+        <w:rPr/>
+      </w:pPr>
+      <w:r>
+        <w:rPr>
+          <w:rFonts w:eastAsia="Aptos" w:cs="Aptos"/>
+        </w:rPr>
+        <w:t xml:space="preserve">(Provide brief examples or descriptions, </w:t>
+      </w:r>
+      <w:r>
+        <w:rPr>
+          <w:rFonts w:eastAsia="Aptos" w:cs="Aptos"/>
+        </w:rPr>
+        <w:t>adding more items to the below list if necessary</w:t>
+      </w:r>
+    </w:p>
+    <w:p xmlns:wp14="http://schemas.microsoft.com/office/word/2010/wordml" wp14:textId="77777777">
       <w:pPr>
         <w:pStyle w:val="ListParagraph"/>
         <w:numPr>
@@ -480,11 +600,113 @@
       <w:r>
         <w:rPr>
           <w:rFonts w:eastAsia="Aptos" w:cs="Aptos"/>
-        </w:rPr>
-        <w:t>Language Refinement</w:t>
+          <w:b/>
+          <w:bCs/>
+        </w:rPr>
+        <w:t>Example 1:</w:t>
+      </w:r>
+      <w:r>
+        <w:rPr>
+          <w:rFonts w:eastAsia="Aptos" w:cs="Aptos"/>
+        </w:rPr>
+        <w:t xml:space="preserve"> [Describe AI-generated content briefly]</w:t>
+      </w:r>
+    </w:p>
+    <w:p xmlns:wp14="http://schemas.microsoft.com/office/word/2010/wordml" wp14:textId="77777777">
+      <w:pPr>
+        <w:pStyle w:val="ListParagraph"/>
+        <w:numPr>
+          <w:ilvl w:val="0"/>
+          <w:numId w:val="1"/>
+        </w:numPr>
+        <w:spacing w:before="0" w:after="0"/>
+        <w:contextualSpacing w:val="1"/>
+        <w:rPr>
+          <w:rFonts w:ascii="Aptos" w:hAnsi="Aptos" w:eastAsia="Aptos" w:cs="Aptos"/>
+        </w:rPr>
+      </w:pPr>
+      <w:r>
+        <w:rPr>
+          <w:rFonts w:eastAsia="Aptos" w:cs="Aptos"/>
+          <w:b w:val="1"/>
+          <w:bCs w:val="1"/>
+        </w:rPr>
+        <w:t>Example 2:</w:t>
+      </w:r>
+      <w:r>
+        <w:rPr>
+          <w:rFonts w:eastAsia="Aptos" w:cs="Aptos"/>
+        </w:rPr>
+        <w:t xml:space="preserve"> ...</w:t>
       </w:r>
     </w:p>
     <w:p>
+      <w:pPr>
+        <w:pStyle w:val="ListParagraph"/>
+        <w:numPr>
+          <w:ilvl w:val="0"/>
+          <w:numId w:val="1"/>
+        </w:numPr>
+        <w:spacing w:before="0" w:after="0"/>
+        <w:contextualSpacing w:val="1"/>
+        <w:rPr>
+          <w:rFonts w:ascii="Aptos" w:hAnsi="Aptos" w:eastAsia="Aptos" w:cs="Aptos"/>
+          <w:b w:val="1"/>
+          <w:bCs w:val="1"/>
+        </w:rPr>
+      </w:pPr>
+      <w:r>
+        <w:rPr>
+          <w:rFonts w:ascii="Aptos" w:hAnsi="Aptos" w:eastAsia="Aptos" w:cs="Aptos"/>
+          <w:b w:val="1"/>
+          <w:bCs w:val="1"/>
+        </w:rPr>
+        <w:t>The IDE AI corrected wrong python syntax and suggested correct options</w:t>
+      </w:r>
+    </w:p>
+    <w:p xmlns:wp14="http://schemas.microsoft.com/office/word/2010/wordml" wp14:textId="77777777">
+      <w:pPr>
+        <w:pStyle w:val="Normal"/>
+        <w:spacing w:before="0" w:after="0"/>
+        <w:rPr>
+          <w:rFonts w:ascii="Aptos" w:hAnsi="Aptos" w:eastAsia="Aptos" w:cs="Aptos"/>
+        </w:rPr>
+      </w:pPr>
+      <w:r>
+        <w:rPr>
+          <w:rFonts w:eastAsia="Aptos" w:cs="Aptos"/>
+        </w:rPr>
+      </w:r>
+    </w:p>
+    <w:p xmlns:wp14="http://schemas.microsoft.com/office/word/2010/wordml" wp14:textId="77777777">
+      <w:pPr>
+        <w:pStyle w:val="Heading4"/>
+        <w:spacing w:before="319" w:after="319"/>
+        <w:rPr/>
+      </w:pPr>
+      <w:r>
+        <w:rPr>
+          <w:rFonts w:eastAsia="Aptos" w:cs="Aptos"/>
+          <w:b/>
+          <w:bCs/>
+        </w:rPr>
+        <w:t>Review and Refinement:</w:t>
+      </w:r>
+    </w:p>
+    <w:p xmlns:wp14="http://schemas.microsoft.com/office/word/2010/wordml" wp14:textId="77777777">
+      <w:pPr>
+        <w:pStyle w:val="Normal"/>
+        <w:spacing w:before="240" w:after="240"/>
+        <w:rPr/>
+      </w:pPr>
+      <w:r>
+        <w:rPr>
+          <w:rFonts w:eastAsia="Aptos" w:cs="Aptos"/>
+        </w:rPr>
+        <w:t>(Select the actions taken to refine AI output)</w:t>
+      </w:r>
+    </w:p>
+    <w:p xmlns:wp14="http://schemas.microsoft.com/office/word/2010/wordml" wp14:textId="77777777">
       <w:pPr>
         <w:pStyle w:val="ListParagraph"/>
         <w:numPr>
@@ -501,58 +723,42 @@
         <w:rPr>
           <w:rFonts w:eastAsia="Aptos" w:cs="Aptos"/>
         </w:rPr>
-        <w:t>Other: [Specify]</w:t>
-      </w:r>
-    </w:p>
-    <w:p>
-      <w:pPr>
-        <w:pStyle w:val="Normal"/>
+        <w:t>Edited AI-generated content for accuracy</w:t>
+      </w:r>
+    </w:p>
+    <w:p xmlns:wp14="http://schemas.microsoft.com/office/word/2010/wordml" wp14:textId="4920D763">
+      <w:pPr>
+        <w:pStyle w:val="ListParagraph"/>
+        <w:numPr>
+          <w:ilvl w:val="0"/>
+          <w:numId w:val="1"/>
+        </w:numPr>
         <w:spacing w:before="0" w:after="0"/>
+        <w:contextualSpacing w:val="1"/>
         <w:rPr>
           <w:rFonts w:ascii="Aptos" w:hAnsi="Aptos" w:eastAsia="Aptos" w:cs="Aptos"/>
-        </w:rPr>
-      </w:pPr>
-      <w:r>
-        <w:rPr>
-          <w:rFonts w:eastAsia="Aptos" w:cs="Aptos"/>
-        </w:rPr>
-      </w:r>
-    </w:p>
-    <w:p>
-      <w:pPr>
-        <w:pStyle w:val="Heading4"/>
-        <w:spacing w:before="319" w:after="319"/>
-        <w:rPr/>
-      </w:pPr>
-      <w:r>
-        <w:rPr>
-          <w:rFonts w:eastAsia="Aptos" w:cs="Aptos"/>
-          <w:b/>
-          <w:bCs/>
-        </w:rPr>
-        <w:t>Details of AI-Generated Content:</w:t>
-      </w:r>
-    </w:p>
-    <w:p>
-      <w:pPr>
-        <w:pStyle w:val="Normal"/>
-        <w:spacing w:before="240" w:after="240"/>
-        <w:rPr/>
-      </w:pPr>
-      <w:r>
-        <w:rPr>
-          <w:rFonts w:eastAsia="Aptos" w:cs="Aptos"/>
-        </w:rPr>
-        <w:t xml:space="preserve">(Provide brief examples or descriptions, </w:t>
-      </w:r>
-      <w:r>
-        <w:rPr>
-          <w:rFonts w:eastAsia="Aptos" w:cs="Aptos"/>
-        </w:rPr>
-        <w:t>adding more items to the below list if necessary</w:t>
-      </w:r>
-    </w:p>
-    <w:p>
+          <w:b w:val="1"/>
+          <w:bCs w:val="1"/>
+        </w:rPr>
+      </w:pPr>
+      <w:r>
+        <w:rPr>
+          <w:rFonts w:eastAsia="Aptos" w:cs="Aptos"/>
+          <w:b w:val="1"/>
+          <w:bCs w:val="1"/>
+        </w:rPr>
+        <w:t>Cross-checked AI output with reliable sources</w:t>
+      </w:r>
+      <w:r>
+        <w:rPr>
+          <w:rFonts w:eastAsia="Aptos" w:cs="Aptos"/>
+          <w:b w:val="1"/>
+          <w:bCs w:val="1"/>
+        </w:rPr>
+        <w:t xml:space="preserve"> (python documentations and W3schools)</w:t>
+      </w:r>
+    </w:p>
+    <w:p xmlns:wp14="http://schemas.microsoft.com/office/word/2010/wordml" wp14:textId="77777777">
       <w:pPr>
         <w:pStyle w:val="ListParagraph"/>
         <w:numPr>
@@ -568,19 +774,11 @@
       <w:r>
         <w:rPr>
           <w:rFonts w:eastAsia="Aptos" w:cs="Aptos"/>
-          <w:b/>
-          <w:bCs/>
-        </w:rPr>
-        <w:t>Example 1:</w:t>
-      </w:r>
-      <w:r>
-        <w:rPr>
-          <w:rFonts w:eastAsia="Aptos" w:cs="Aptos"/>
-        </w:rPr>
-        <w:t xml:space="preserve"> [Describe AI-generated content briefly]</w:t>
-      </w:r>
-    </w:p>
-    <w:p>
+        </w:rPr>
+        <w:t>Made significant changes to AI-generated text or images</w:t>
+      </w:r>
+    </w:p>
+    <w:p xmlns:wp14="http://schemas.microsoft.com/office/word/2010/wordml" wp14:textId="77777777">
       <w:pPr>
         <w:pStyle w:val="ListParagraph"/>
         <w:numPr>
@@ -596,33 +794,54 @@
       <w:r>
         <w:rPr>
           <w:rFonts w:eastAsia="Aptos" w:cs="Aptos"/>
-          <w:b/>
-          <w:bCs/>
-        </w:rPr>
-        <w:t>Example 2:</w:t>
-      </w:r>
-      <w:r>
-        <w:rPr>
-          <w:rFonts w:eastAsia="Aptos" w:cs="Aptos"/>
-        </w:rPr>
-        <w:t xml:space="preserve"> ...</w:t>
-      </w:r>
-    </w:p>
-    <w:p>
-      <w:pPr>
-        <w:pStyle w:val="Normal"/>
-        <w:spacing w:before="0" w:after="0"/>
-        <w:rPr>
-          <w:rFonts w:ascii="Aptos" w:hAnsi="Aptos" w:eastAsia="Aptos" w:cs="Aptos"/>
-        </w:rPr>
-      </w:pPr>
-      <w:r>
-        <w:rPr>
-          <w:rFonts w:eastAsia="Aptos" w:cs="Aptos"/>
-        </w:rPr>
-      </w:r>
-    </w:p>
-    <w:p>
+        </w:rPr>
+        <w:t>Other: [Specify]</w:t>
+      </w:r>
+    </w:p>
+    <w:p xmlns:wp14="http://schemas.microsoft.com/office/word/2010/wordml" wp14:textId="77777777">
+      <w:pPr>
+        <w:pStyle w:val="Normal"/>
+        <w:rPr>
+          <w:b/>
+          <w:bCs/>
+        </w:rPr>
+      </w:pPr>
+      <w:r>
+        <w:rPr>
+          <w:b/>
+          <w:bCs/>
+        </w:rPr>
+      </w:r>
+    </w:p>
+    <w:p xmlns:wp14="http://schemas.microsoft.com/office/word/2010/wordml" wp14:textId="77777777">
+      <w:pPr>
+        <w:pStyle w:val="Normal"/>
+        <w:rPr>
+          <w:b/>
+          <w:bCs/>
+        </w:rPr>
+      </w:pPr>
+      <w:r>
+        <w:rPr>
+          <w:b/>
+          <w:bCs/>
+        </w:rPr>
+      </w:r>
+    </w:p>
+    <w:p xmlns:wp14="http://schemas.microsoft.com/office/word/2010/wordml" wp14:textId="77777777">
+      <w:pPr>
+        <w:pStyle w:val="Normal"/>
+        <w:rPr/>
+      </w:pPr>
+      <w:r>
+        <w:rPr/>
+        <w:t>(form continues on next page)</w:t>
+      </w:r>
+      <w:r>
+        <w:br w:type="page"/>
+      </w:r>
+    </w:p>
+    <w:p xmlns:wp14="http://schemas.microsoft.com/office/word/2010/wordml" wp14:textId="77777777">
       <w:pPr>
         <w:pStyle w:val="Heading4"/>
         <w:spacing w:before="319" w:after="319"/>
@@ -634,10 +853,10 @@
           <w:b/>
           <w:bCs/>
         </w:rPr>
-        <w:t>Review and Refinement:</w:t>
-      </w:r>
-    </w:p>
-    <w:p>
+        <w:t>Quality Assurance and Ethical Considerations:</w:t>
+      </w:r>
+    </w:p>
+    <w:p xmlns:wp14="http://schemas.microsoft.com/office/word/2010/wordml" wp14:textId="77777777">
       <w:pPr>
         <w:pStyle w:val="Normal"/>
         <w:spacing w:before="240" w:after="240"/>
@@ -647,133 +866,80 @@
         <w:rPr>
           <w:rFonts w:eastAsia="Aptos" w:cs="Aptos"/>
         </w:rPr>
-        <w:t>(Select the actions taken to refine AI output)</w:t>
-      </w:r>
-    </w:p>
-    <w:p>
-      <w:pPr>
-        <w:pStyle w:val="ListParagraph"/>
-        <w:numPr>
-          <w:ilvl w:val="0"/>
-          <w:numId w:val="1"/>
-        </w:numPr>
-        <w:spacing w:before="0" w:after="0"/>
-        <w:contextualSpacing/>
-        <w:rPr>
-          <w:rFonts w:ascii="Aptos" w:hAnsi="Aptos" w:eastAsia="Aptos" w:cs="Aptos"/>
-        </w:rPr>
-      </w:pPr>
-      <w:r>
-        <w:rPr>
-          <w:rFonts w:eastAsia="Aptos" w:cs="Aptos"/>
-        </w:rPr>
-        <w:t>Edited AI-generated content for accuracy</w:t>
-      </w:r>
-    </w:p>
-    <w:p>
-      <w:pPr>
-        <w:pStyle w:val="ListParagraph"/>
-        <w:numPr>
-          <w:ilvl w:val="0"/>
-          <w:numId w:val="1"/>
-        </w:numPr>
-        <w:spacing w:before="0" w:after="0"/>
-        <w:contextualSpacing/>
-        <w:rPr>
-          <w:rFonts w:ascii="Aptos" w:hAnsi="Aptos" w:eastAsia="Aptos" w:cs="Aptos"/>
-        </w:rPr>
-      </w:pPr>
-      <w:r>
-        <w:rPr>
-          <w:rFonts w:eastAsia="Aptos" w:cs="Aptos"/>
-        </w:rPr>
-        <w:t>Cross-checked AI output with reliable sources</w:t>
-      </w:r>
-    </w:p>
-    <w:p>
-      <w:pPr>
-        <w:pStyle w:val="ListParagraph"/>
-        <w:numPr>
-          <w:ilvl w:val="0"/>
-          <w:numId w:val="1"/>
-        </w:numPr>
-        <w:spacing w:before="0" w:after="0"/>
-        <w:contextualSpacing/>
-        <w:rPr>
-          <w:rFonts w:ascii="Aptos" w:hAnsi="Aptos" w:eastAsia="Aptos" w:cs="Aptos"/>
-        </w:rPr>
-      </w:pPr>
-      <w:r>
-        <w:rPr>
-          <w:rFonts w:eastAsia="Aptos" w:cs="Aptos"/>
-        </w:rPr>
-        <w:t>Made significant changes to AI-generated text or images</w:t>
-      </w:r>
-    </w:p>
-    <w:p>
-      <w:pPr>
-        <w:pStyle w:val="ListParagraph"/>
-        <w:numPr>
-          <w:ilvl w:val="0"/>
-          <w:numId w:val="1"/>
-        </w:numPr>
-        <w:spacing w:before="0" w:after="0"/>
-        <w:contextualSpacing/>
-        <w:rPr>
-          <w:rFonts w:ascii="Aptos" w:hAnsi="Aptos" w:eastAsia="Aptos" w:cs="Aptos"/>
-        </w:rPr>
-      </w:pPr>
-      <w:r>
-        <w:rPr>
-          <w:rFonts w:eastAsia="Aptos" w:cs="Aptos"/>
-        </w:rPr>
-        <w:t>Other: [Specify]</w:t>
-      </w:r>
-    </w:p>
-    <w:p>
-      <w:pPr>
-        <w:pStyle w:val="Normal"/>
-        <w:rPr>
-          <w:b/>
-          <w:bCs/>
-        </w:rPr>
-      </w:pPr>
-      <w:r>
-        <w:rPr>
-          <w:b/>
-          <w:bCs/>
-        </w:rPr>
-      </w:r>
-    </w:p>
-    <w:p>
-      <w:pPr>
-        <w:pStyle w:val="Normal"/>
-        <w:rPr>
-          <w:b/>
-          <w:bCs/>
-        </w:rPr>
-      </w:pPr>
-      <w:r>
-        <w:rPr>
-          <w:b/>
-          <w:bCs/>
-        </w:rPr>
-      </w:r>
-    </w:p>
-    <w:p>
-      <w:pPr>
-        <w:pStyle w:val="Normal"/>
-        <w:rPr/>
-      </w:pPr>
-      <w:r>
-        <w:rPr/>
-        <w:t>(form continues on next page)</w:t>
-      </w:r>
-      <w:r>
-        <w:br w:type="page"/>
-      </w:r>
-    </w:p>
-    <w:p>
+        <w:t>(Briefly describe how you ensured the quality and ethical use of AI)</w:t>
+      </w:r>
+    </w:p>
+    <w:p xmlns:wp14="http://schemas.microsoft.com/office/word/2010/wordml" wp14:textId="5E49ABB5">
+      <w:pPr>
+        <w:pStyle w:val="Normal"/>
+        <w:spacing w:before="240" w:after="240"/>
+        <w:rPr>
+          <w:rFonts w:eastAsia="Aptos" w:cs="Aptos"/>
+        </w:rPr>
+      </w:pPr>
+      <w:r>
+        <w:rPr>
+          <w:rFonts w:eastAsia="Aptos" w:cs="Aptos"/>
+          <w:b w:val="1"/>
+          <w:bCs w:val="1"/>
+        </w:rPr>
+        <w:t>Quality Check:</w:t>
+      </w:r>
+      <w:r>
+        <w:rPr>
+          <w:rFonts w:eastAsia="Aptos" w:cs="Aptos"/>
+        </w:rPr>
+        <w:t xml:space="preserve"> </w:t>
+      </w:r>
+      <w:r>
+        <w:rPr>
+          <w:rFonts w:eastAsia="Aptos" w:cs="Aptos"/>
+        </w:rPr>
+        <w:t>Ensured syntax suggested were well within my current scope of understanding</w:t>
+      </w:r>
+    </w:p>
+    <w:p xmlns:wp14="http://schemas.microsoft.com/office/word/2010/wordml" wp14:textId="335FD030">
+      <w:pPr>
+        <w:pStyle w:val="Normal"/>
+        <w:spacing w:before="240" w:after="240"/>
+      </w:pPr>
+      <w:r>
+        <w:rPr>
+          <w:rFonts w:eastAsia="Aptos" w:cs="Aptos"/>
+          <w:b w:val="1"/>
+          <w:bCs w:val="1"/>
+        </w:rPr>
+        <w:t>Ethical Use:</w:t>
+      </w:r>
+      <w:r>
+        <w:rPr>
+          <w:rFonts w:eastAsia="Aptos" w:cs="Aptos"/>
+        </w:rPr>
+        <w:t xml:space="preserve"> </w:t>
+      </w:r>
+      <w:r>
+        <w:rPr>
+          <w:rFonts w:eastAsia="Aptos" w:cs="Aptos"/>
+        </w:rPr>
+        <w:t>Avoided relying on syntax suggestion without external verification</w:t>
+      </w:r>
+    </w:p>
+    <w:p xmlns:wp14="http://schemas.microsoft.com/office/word/2010/wordml" wp14:textId="77777777">
+      <w:pPr>
+        <w:pStyle w:val="Normal"/>
+        <w:rPr>
+          <w:b/>
+          <w:bCs/>
+        </w:rPr>
+      </w:pPr>
+      <w:r>
+        <w:rPr>
+          <w:b/>
+          <w:bCs/>
+        </w:rPr>
+      </w:r>
+    </w:p>
+    <w:p xmlns:wp14="http://schemas.microsoft.com/office/word/2010/wordml" wp14:textId="77777777">
       <w:pPr>
         <w:pStyle w:val="Heading4"/>
         <w:spacing w:before="319" w:after="319"/>
@@ -785,10 +951,10 @@
           <w:b/>
           <w:bCs/>
         </w:rPr>
-        <w:t>Quality Assurance and Ethical Considerations:</w:t>
-      </w:r>
-    </w:p>
-    <w:p>
+        <w:t>Reflection on AI Usage:</w:t>
+      </w:r>
+    </w:p>
+    <w:p xmlns:wp14="http://schemas.microsoft.com/office/word/2010/wordml" wp14:textId="77777777">
       <w:pPr>
         <w:pStyle w:val="Normal"/>
         <w:spacing w:before="240" w:after="240"/>
@@ -798,105 +964,22 @@
         <w:rPr>
           <w:rFonts w:eastAsia="Aptos" w:cs="Aptos"/>
         </w:rPr>
-        <w:t>(Briefly describe how you ensured the quality and ethical use of AI)</w:t>
-      </w:r>
-    </w:p>
-    <w:p>
+        <w:t>(Briefly reflect on your experience using AI)</w:t>
+      </w:r>
+    </w:p>
+    <w:p xmlns:wp14="http://schemas.microsoft.com/office/word/2010/wordml" wp14:textId="703DE1C1">
       <w:pPr>
         <w:pStyle w:val="Normal"/>
         <w:spacing w:before="240" w:after="240"/>
-        <w:rPr/>
-      </w:pPr>
-      <w:r>
-        <w:rPr>
-          <w:rFonts w:eastAsia="Aptos" w:cs="Aptos"/>
-          <w:b/>
-          <w:bCs/>
-        </w:rPr>
-        <w:t>Quality Check:</w:t>
-      </w:r>
-      <w:r>
-        <w:rPr>
-          <w:rFonts w:eastAsia="Aptos" w:cs="Aptos"/>
-        </w:rPr>
-        <w:t xml:space="preserve"> [Briefly describe actions, e.g., "Verified facts with external sources."]</w:t>
-      </w:r>
-    </w:p>
-    <w:p>
-      <w:pPr>
-        <w:pStyle w:val="Normal"/>
-        <w:spacing w:before="240" w:after="240"/>
-        <w:rPr/>
-      </w:pPr>
-      <w:r>
-        <w:rPr>
-          <w:rFonts w:eastAsia="Aptos" w:cs="Aptos"/>
-          <w:b/>
-          <w:bCs/>
-        </w:rPr>
-        <w:t>Ethical Use:</w:t>
-      </w:r>
-      <w:r>
-        <w:rPr>
-          <w:rFonts w:eastAsia="Aptos" w:cs="Aptos"/>
-        </w:rPr>
-        <w:t xml:space="preserve"> [Briefly describe, e.g., "Avoided plagiarism by editing AI output and adding original content."]</w:t>
-      </w:r>
-    </w:p>
-    <w:p>
-      <w:pPr>
-        <w:pStyle w:val="Normal"/>
-        <w:rPr>
-          <w:b/>
-          <w:bCs/>
-        </w:rPr>
-      </w:pPr>
-      <w:r>
-        <w:rPr>
-          <w:b/>
-          <w:bCs/>
-        </w:rPr>
-      </w:r>
-    </w:p>
-    <w:p>
-      <w:pPr>
-        <w:pStyle w:val="Heading4"/>
-        <w:spacing w:before="319" w:after="319"/>
-        <w:rPr/>
-      </w:pPr>
-      <w:r>
-        <w:rPr>
-          <w:rFonts w:eastAsia="Aptos" w:cs="Aptos"/>
-          <w:b/>
-          <w:bCs/>
-        </w:rPr>
-        <w:t>Reflection on AI Usage:</w:t>
-      </w:r>
-    </w:p>
-    <w:p>
-      <w:pPr>
-        <w:pStyle w:val="Normal"/>
-        <w:spacing w:before="240" w:after="240"/>
-        <w:rPr/>
-      </w:pPr>
-      <w:r>
-        <w:rPr>
-          <w:rFonts w:eastAsia="Aptos" w:cs="Aptos"/>
-        </w:rPr>
-        <w:t>(Briefly reflect on your experience using AI)</w:t>
-      </w:r>
-    </w:p>
-    <w:p>
-      <w:pPr>
-        <w:pStyle w:val="Normal"/>
-        <w:spacing w:before="240" w:after="240"/>
-        <w:rPr/>
-      </w:pPr>
-      <w:r>
-        <w:rPr>
-          <w:rFonts w:eastAsia="Aptos" w:cs="Aptos"/>
-          <w:b/>
-          <w:bCs/>
+        <w:rPr>
+          <w:rFonts w:eastAsia="Aptos" w:cs="Aptos"/>
+        </w:rPr>
+      </w:pPr>
+      <w:r>
+        <w:rPr>
+          <w:rFonts w:eastAsia="Aptos" w:cs="Aptos"/>
+          <w:b w:val="1"/>
+          <w:bCs w:val="1"/>
         </w:rPr>
         <w:t>Reflection:</w:t>
       </w:r>
@@ -904,40 +987,46 @@
         <w:rPr>
           <w:rFonts w:eastAsia="Aptos" w:cs="Aptos"/>
         </w:rPr>
-        <w:t xml:space="preserve"> [One or two sentences on how AI helped with the assessment.]</w:t>
-      </w:r>
-    </w:p>
-    <w:p>
-      <w:pPr>
-        <w:pStyle w:val="Normal"/>
-        <w:rPr>
-          <w:b/>
-          <w:bCs/>
-        </w:rPr>
-      </w:pPr>
-      <w:r>
-        <w:rPr>
-          <w:b/>
-          <w:bCs/>
-        </w:rPr>
-      </w:r>
-    </w:p>
-    <w:p>
-      <w:pPr>
-        <w:pStyle w:val="Normal"/>
-        <w:rPr>
-          <w:b/>
-          <w:bCs/>
-        </w:rPr>
-      </w:pPr>
-      <w:r>
-        <w:rPr>
-          <w:b/>
-          <w:bCs/>
-        </w:rPr>
-      </w:r>
-    </w:p>
-    <w:p>
+        <w:t xml:space="preserve"> </w:t>
+      </w:r>
+      <w:r>
+        <w:rPr>
+          <w:rFonts w:eastAsia="Aptos" w:cs="Aptos"/>
+        </w:rPr>
+        <w:t>The inline syntax validation helped to catch runtime errors and save hours in debugging</w:t>
+      </w:r>
+    </w:p>
+    <w:p xmlns:wp14="http://schemas.microsoft.com/office/word/2010/wordml" wp14:textId="77777777">
+      <w:pPr>
+        <w:pStyle w:val="Normal"/>
+        <w:rPr>
+          <w:b/>
+          <w:bCs/>
+        </w:rPr>
+      </w:pPr>
+      <w:r>
+        <w:rPr>
+          <w:b/>
+          <w:bCs/>
+        </w:rPr>
+      </w:r>
+    </w:p>
+    <w:p xmlns:wp14="http://schemas.microsoft.com/office/word/2010/wordml" wp14:textId="77777777">
+      <w:pPr>
+        <w:pStyle w:val="Normal"/>
+        <w:rPr>
+          <w:b/>
+          <w:bCs/>
+        </w:rPr>
+      </w:pPr>
+      <w:r>
+        <w:rPr>
+          <w:b/>
+          <w:bCs/>
+        </w:rPr>
+      </w:r>
+    </w:p>
+    <w:p xmlns:wp14="http://schemas.microsoft.com/office/word/2010/wordml" wp14:textId="77777777">
       <w:pPr>
         <w:pStyle w:val="Normal"/>
         <w:rPr/>
@@ -950,7 +1039,7 @@
         <w:t>AI Usage Declaration</w:t>
       </w:r>
     </w:p>
-    <w:p>
+    <w:p xmlns:wp14="http://schemas.microsoft.com/office/word/2010/wordml" wp14:textId="77777777">
       <w:pPr>
         <w:pStyle w:val="Normal"/>
         <w:rPr/>
@@ -990,7 +1079,7 @@
         <w:t>], declare that the information provided in this AI Usage Declaration is accurate and truthful. I have adhered to the academic integrity guidelines and properly referenced all AI-generated content used in this assessment.</w:t>
       </w:r>
     </w:p>
-    <w:p>
+    <w:p xmlns:wp14="http://schemas.microsoft.com/office/word/2010/wordml" wp14:textId="77777777">
       <w:pPr>
         <w:pStyle w:val="Normal"/>
         <w:ind w:left="720"/>
@@ -1004,7 +1093,7 @@
         <w:t>Original Work Declaration</w:t>
       </w:r>
     </w:p>
-    <w:p>
+    <w:p xmlns:wp14="http://schemas.microsoft.com/office/word/2010/wordml" wp14:textId="08D94780">
       <w:pPr>
         <w:pStyle w:val="Normal"/>
         <w:numPr>
@@ -1015,10 +1104,34 @@
       </w:pPr>
       <w:r>
         <w:rPr/>
-        <w:t>I declare that the work submitted is my own and that AI was used only as a tool to assist me in its completion.</w:t>
-      </w:r>
-    </w:p>
-    <w:p>
+        <w:t xml:space="preserve">I </w:t>
+      </w:r>
+      <w:r>
+        <w:rPr/>
+        <w:t xml:space="preserve">Blossom Babalola </w:t>
+      </w:r>
+      <w:r>
+        <w:rPr/>
+        <w:t xml:space="preserve">declare that the work </w:t>
+      </w:r>
+      <w:r>
+        <w:rPr/>
+        <w:t>submitted</w:t>
+      </w:r>
+      <w:r>
+        <w:rPr/>
+        <w:t xml:space="preserve"> is my own and that AI was used only as a tool to </w:t>
+      </w:r>
+      <w:r>
+        <w:rPr/>
+        <w:t>assist</w:t>
+      </w:r>
+      <w:r>
+        <w:rPr/>
+        <w:t xml:space="preserve"> me in its completion.</w:t>
+      </w:r>
+    </w:p>
+    <w:p xmlns:wp14="http://schemas.microsoft.com/office/word/2010/wordml" wp14:textId="77777777">
       <w:pPr>
         <w:pStyle w:val="Normal"/>
         <w:numPr>
@@ -1032,12 +1145,12 @@
         <w:t>I understand that I am responsible for the content and quality of the work submitted, even if AI was used to generate parts of it.</w:t>
       </w:r>
     </w:p>
-    <w:p>
+    <w:p xmlns:wp14="http://schemas.microsoft.com/office/word/2010/wordml" wp14:textId="77777777">
       <w:pPr>
         <w:pStyle w:val="Normal"/>
         <w:widowControl/>
         <w:bidi w:val="0"/>
-        <w:spacing w:lineRule="auto" w:line="259" w:before="0" w:after="160"/>
+        <w:spacing w:before="0" w:after="160" w:line="259" w:lineRule="auto"/>
         <w:jc w:val="left"/>
         <w:rPr/>
       </w:pPr>
@@ -1047,12 +1160,13 @@
     </w:p>
     <w:sectPr>
       <w:type w:val="nextPage"/>
-      <w:pgSz w:w="12240" w:h="15840"/>
-      <w:pgMar w:left="1440" w:right="1440" w:gutter="0" w:header="0" w:top="1440" w:footer="0" w:bottom="1440"/>
+      <w:pgSz w:w="12240" w:h="15840" w:orient="portrait"/>
+      <w:pgMar w:top="1440" w:right="1440" w:bottom="1440" w:left="1440" w:header="0" w:footer="0" w:gutter="0"/>
       <w:pgNumType w:fmt="decimal"/>
       <w:formProt w:val="false"/>
       <w:textDirection w:val="lrTb"/>
       <w:docGrid w:type="default" w:linePitch="360" w:charSpace="4096"/>
+      <w:cols w:num="1"/>
     </w:sectPr>
   </w:body>
 </w:document>
@@ -1073,7 +1187,7 @@
         <w:ind w:left="720" w:hanging="360"/>
       </w:pPr>
       <w:rPr>
-        <w:rFonts w:ascii="Symbol" w:hAnsi="Symbol" w:cs="Symbol" w:hint="default"/>
+        <w:rFonts w:hint="default" w:ascii="Symbol" w:hAnsi="Symbol" w:cs="Symbol"/>
         <w:sz w:val="20"/>
       </w:rPr>
     </w:lvl>
@@ -1089,7 +1203,7 @@
         <w:ind w:left="1440" w:hanging="360"/>
       </w:pPr>
       <w:rPr>
-        <w:rFonts w:ascii="Symbol" w:hAnsi="Symbol" w:cs="Symbol" w:hint="default"/>
+        <w:rFonts w:hint="default" w:ascii="Symbol" w:hAnsi="Symbol" w:cs="Symbol"/>
         <w:sz w:val="20"/>
       </w:rPr>
     </w:lvl>
@@ -1105,7 +1219,7 @@
         <w:ind w:left="2160" w:hanging="360"/>
       </w:pPr>
       <w:rPr>
-        <w:rFonts w:ascii="Symbol" w:hAnsi="Symbol" w:cs="Symbol" w:hint="default"/>
+        <w:rFonts w:hint="default" w:ascii="Symbol" w:hAnsi="Symbol" w:cs="Symbol"/>
         <w:sz w:val="20"/>
       </w:rPr>
     </w:lvl>
@@ -1121,7 +1235,7 @@
         <w:ind w:left="2880" w:hanging="360"/>
       </w:pPr>
       <w:rPr>
-        <w:rFonts w:ascii="Symbol" w:hAnsi="Symbol" w:cs="Symbol" w:hint="default"/>
+        <w:rFonts w:hint="default" w:ascii="Symbol" w:hAnsi="Symbol" w:cs="Symbol"/>
         <w:sz w:val="20"/>
       </w:rPr>
     </w:lvl>
@@ -1137,7 +1251,7 @@
         <w:ind w:left="3600" w:hanging="360"/>
       </w:pPr>
       <w:rPr>
-        <w:rFonts w:ascii="Symbol" w:hAnsi="Symbol" w:cs="Symbol" w:hint="default"/>
+        <w:rFonts w:hint="default" w:ascii="Symbol" w:hAnsi="Symbol" w:cs="Symbol"/>
         <w:sz w:val="20"/>
       </w:rPr>
     </w:lvl>
@@ -1153,7 +1267,7 @@
         <w:ind w:left="4320" w:hanging="360"/>
       </w:pPr>
       <w:rPr>
-        <w:rFonts w:ascii="Symbol" w:hAnsi="Symbol" w:cs="Symbol" w:hint="default"/>
+        <w:rFonts w:hint="default" w:ascii="Symbol" w:hAnsi="Symbol" w:cs="Symbol"/>
         <w:sz w:val="20"/>
       </w:rPr>
     </w:lvl>
@@ -1169,7 +1283,7 @@
         <w:ind w:left="5040" w:hanging="360"/>
       </w:pPr>
       <w:rPr>
-        <w:rFonts w:ascii="Symbol" w:hAnsi="Symbol" w:cs="Symbol" w:hint="default"/>
+        <w:rFonts w:hint="default" w:ascii="Symbol" w:hAnsi="Symbol" w:cs="Symbol"/>
         <w:sz w:val="20"/>
       </w:rPr>
     </w:lvl>
@@ -1185,7 +1299,7 @@
         <w:ind w:left="5760" w:hanging="360"/>
       </w:pPr>
       <w:rPr>
-        <w:rFonts w:ascii="Symbol" w:hAnsi="Symbol" w:cs="Symbol" w:hint="default"/>
+        <w:rFonts w:hint="default" w:ascii="Symbol" w:hAnsi="Symbol" w:cs="Symbol"/>
         <w:sz w:val="20"/>
       </w:rPr>
     </w:lvl>
@@ -1201,10 +1315,11 @@
         <w:ind w:left="6480" w:hanging="360"/>
       </w:pPr>
       <w:rPr>
-        <w:rFonts w:ascii="Symbol" w:hAnsi="Symbol" w:cs="Symbol" w:hint="default"/>
+        <w:rFonts w:hint="default" w:ascii="Symbol" w:hAnsi="Symbol" w:cs="Symbol"/>
         <w:sz w:val="20"/>
       </w:rPr>
     </w:lvl>
+    <w:nsid w:val="1a44f656"/>
   </w:abstractNum>
   <w:abstractNum w:abstractNumId="2">
     <w:lvl w:ilvl="0">
@@ -1219,7 +1334,7 @@
         <w:ind w:left="720" w:hanging="360"/>
       </w:pPr>
       <w:rPr>
-        <w:rFonts w:ascii="Symbol" w:hAnsi="Symbol" w:cs="Symbol" w:hint="default"/>
+        <w:rFonts w:hint="default" w:ascii="Symbol" w:hAnsi="Symbol" w:cs="Symbol"/>
         <w:sz w:val="20"/>
       </w:rPr>
     </w:lvl>
@@ -1235,7 +1350,7 @@
         <w:ind w:left="1440" w:hanging="360"/>
       </w:pPr>
       <w:rPr>
-        <w:rFonts w:ascii="Symbol" w:hAnsi="Symbol" w:cs="Symbol" w:hint="default"/>
+        <w:rFonts w:hint="default" w:ascii="Symbol" w:hAnsi="Symbol" w:cs="Symbol"/>
         <w:sz w:val="20"/>
       </w:rPr>
     </w:lvl>
@@ -1251,7 +1366,7 @@
         <w:ind w:left="2160" w:hanging="360"/>
       </w:pPr>
       <w:rPr>
-        <w:rFonts w:ascii="Symbol" w:hAnsi="Symbol" w:cs="Symbol" w:hint="default"/>
+        <w:rFonts w:hint="default" w:ascii="Symbol" w:hAnsi="Symbol" w:cs="Symbol"/>
         <w:sz w:val="20"/>
       </w:rPr>
     </w:lvl>
@@ -1267,7 +1382,7 @@
         <w:ind w:left="2880" w:hanging="360"/>
       </w:pPr>
       <w:rPr>
-        <w:rFonts w:ascii="Symbol" w:hAnsi="Symbol" w:cs="Symbol" w:hint="default"/>
+        <w:rFonts w:hint="default" w:ascii="Symbol" w:hAnsi="Symbol" w:cs="Symbol"/>
         <w:sz w:val="20"/>
       </w:rPr>
     </w:lvl>
@@ -1283,7 +1398,7 @@
         <w:ind w:left="3600" w:hanging="360"/>
       </w:pPr>
       <w:rPr>
-        <w:rFonts w:ascii="Symbol" w:hAnsi="Symbol" w:cs="Symbol" w:hint="default"/>
+        <w:rFonts w:hint="default" w:ascii="Symbol" w:hAnsi="Symbol" w:cs="Symbol"/>
         <w:sz w:val="20"/>
       </w:rPr>
     </w:lvl>
@@ -1299,7 +1414,7 @@
         <w:ind w:left="4320" w:hanging="360"/>
       </w:pPr>
       <w:rPr>
-        <w:rFonts w:ascii="Symbol" w:hAnsi="Symbol" w:cs="Symbol" w:hint="default"/>
+        <w:rFonts w:hint="default" w:ascii="Symbol" w:hAnsi="Symbol" w:cs="Symbol"/>
         <w:sz w:val="20"/>
       </w:rPr>
     </w:lvl>
@@ -1315,7 +1430,7 @@
         <w:ind w:left="5040" w:hanging="360"/>
       </w:pPr>
       <w:rPr>
-        <w:rFonts w:ascii="Symbol" w:hAnsi="Symbol" w:cs="Symbol" w:hint="default"/>
+        <w:rFonts w:hint="default" w:ascii="Symbol" w:hAnsi="Symbol" w:cs="Symbol"/>
         <w:sz w:val="20"/>
       </w:rPr>
     </w:lvl>
@@ -1331,7 +1446,7 @@
         <w:ind w:left="5760" w:hanging="360"/>
       </w:pPr>
       <w:rPr>
-        <w:rFonts w:ascii="Symbol" w:hAnsi="Symbol" w:cs="Symbol" w:hint="default"/>
+        <w:rFonts w:hint="default" w:ascii="Symbol" w:hAnsi="Symbol" w:cs="Symbol"/>
         <w:sz w:val="20"/>
       </w:rPr>
     </w:lvl>
@@ -1347,10 +1462,11 @@
         <w:ind w:left="6480" w:hanging="360"/>
       </w:pPr>
       <w:rPr>
-        <w:rFonts w:ascii="Symbol" w:hAnsi="Symbol" w:cs="Symbol" w:hint="default"/>
+        <w:rFonts w:hint="default" w:ascii="Symbol" w:hAnsi="Symbol" w:cs="Symbol"/>
         <w:sz w:val="20"/>
       </w:rPr>
     </w:lvl>
+    <w:nsid w:val="626b203f"/>
   </w:abstractNum>
   <w:abstractNum w:abstractNumId="3">
     <w:lvl w:ilvl="0">
@@ -1365,7 +1481,7 @@
         <w:ind w:left="1080" w:hanging="360"/>
       </w:pPr>
       <w:rPr>
-        <w:rFonts w:ascii="Symbol" w:hAnsi="Symbol" w:cs="Symbol" w:hint="default"/>
+        <w:rFonts w:hint="default" w:ascii="Symbol" w:hAnsi="Symbol" w:cs="Symbol"/>
         <w:sz w:val="20"/>
       </w:rPr>
     </w:lvl>
@@ -1381,7 +1497,7 @@
         <w:ind w:left="1800" w:hanging="360"/>
       </w:pPr>
       <w:rPr>
-        <w:rFonts w:ascii="Symbol" w:hAnsi="Symbol" w:cs="Symbol" w:hint="default"/>
+        <w:rFonts w:hint="default" w:ascii="Symbol" w:hAnsi="Symbol" w:cs="Symbol"/>
         <w:sz w:val="20"/>
       </w:rPr>
     </w:lvl>
@@ -1397,7 +1513,7 @@
         <w:ind w:left="2520" w:hanging="360"/>
       </w:pPr>
       <w:rPr>
-        <w:rFonts w:ascii="Symbol" w:hAnsi="Symbol" w:cs="Symbol" w:hint="default"/>
+        <w:rFonts w:hint="default" w:ascii="Symbol" w:hAnsi="Symbol" w:cs="Symbol"/>
         <w:sz w:val="20"/>
       </w:rPr>
     </w:lvl>
@@ -1413,7 +1529,7 @@
         <w:ind w:left="3240" w:hanging="360"/>
       </w:pPr>
       <w:rPr>
-        <w:rFonts w:ascii="Symbol" w:hAnsi="Symbol" w:cs="Symbol" w:hint="default"/>
+        <w:rFonts w:hint="default" w:ascii="Symbol" w:hAnsi="Symbol" w:cs="Symbol"/>
         <w:sz w:val="20"/>
       </w:rPr>
     </w:lvl>
@@ -1429,7 +1545,7 @@
         <w:ind w:left="3960" w:hanging="360"/>
       </w:pPr>
       <w:rPr>
-        <w:rFonts w:ascii="Symbol" w:hAnsi="Symbol" w:cs="Symbol" w:hint="default"/>
+        <w:rFonts w:hint="default" w:ascii="Symbol" w:hAnsi="Symbol" w:cs="Symbol"/>
         <w:sz w:val="20"/>
       </w:rPr>
     </w:lvl>
@@ -1445,7 +1561,7 @@
         <w:ind w:left="4680" w:hanging="360"/>
       </w:pPr>
       <w:rPr>
-        <w:rFonts w:ascii="Symbol" w:hAnsi="Symbol" w:cs="Symbol" w:hint="default"/>
+        <w:rFonts w:hint="default" w:ascii="Symbol" w:hAnsi="Symbol" w:cs="Symbol"/>
         <w:sz w:val="20"/>
       </w:rPr>
     </w:lvl>
@@ -1461,7 +1577,7 @@
         <w:ind w:left="5400" w:hanging="360"/>
       </w:pPr>
       <w:rPr>
-        <w:rFonts w:ascii="Symbol" w:hAnsi="Symbol" w:cs="Symbol" w:hint="default"/>
+        <w:rFonts w:hint="default" w:ascii="Symbol" w:hAnsi="Symbol" w:cs="Symbol"/>
         <w:sz w:val="20"/>
       </w:rPr>
     </w:lvl>
@@ -1477,7 +1593,7 @@
         <w:ind w:left="6120" w:hanging="360"/>
       </w:pPr>
       <w:rPr>
-        <w:rFonts w:ascii="Symbol" w:hAnsi="Symbol" w:cs="Symbol" w:hint="default"/>
+        <w:rFonts w:hint="default" w:ascii="Symbol" w:hAnsi="Symbol" w:cs="Symbol"/>
         <w:sz w:val="20"/>
       </w:rPr>
     </w:lvl>
@@ -1493,10 +1609,11 @@
         <w:ind w:left="6840" w:hanging="360"/>
       </w:pPr>
       <w:rPr>
-        <w:rFonts w:ascii="Symbol" w:hAnsi="Symbol" w:cs="Symbol" w:hint="default"/>
+        <w:rFonts w:hint="default" w:ascii="Symbol" w:hAnsi="Symbol" w:cs="Symbol"/>
         <w:sz w:val="20"/>
       </w:rPr>
     </w:lvl>
+    <w:nsid w:val="75d149f9"/>
   </w:abstractNum>
   <w:abstractNum w:abstractNumId="4">
     <w:lvl w:ilvl="0">
@@ -1616,6 +1733,7 @@
         <w:ind w:left="0" w:hanging="0"/>
       </w:pPr>
     </w:lvl>
+    <w:nsid w:val="1e1baacc"/>
   </w:abstractNum>
   <w:num w:numId="1">
     <w:abstractNumId w:val="1"/>
@@ -1633,11 +1751,11 @@
 </file>
 
 <file path=word/styles.xml><?xml version="1.0" encoding="utf-8"?>
-<w:styles xmlns:w="http://schemas.openxmlformats.org/wordprocessingml/2006/main" xmlns:w14="http://schemas.microsoft.com/office/word/2010/wordml" xmlns:mc="http://schemas.openxmlformats.org/markup-compatibility/2006" mc:Ignorable="w14">
+<w:styles xmlns:wp14="http://schemas.microsoft.com/office/word/2010/wordprocessingDrawing" xmlns:w="http://schemas.openxmlformats.org/wordprocessingml/2006/main" xmlns:w14="http://schemas.microsoft.com/office/word/2010/wordml" xmlns:mc="http://schemas.openxmlformats.org/markup-compatibility/2006" mc:Ignorable="w14 wp14">
   <w:docDefaults>
     <w:rPrDefault>
       <w:rPr>
-        <w:rFonts w:ascii="Aptos" w:hAnsi="Aptos" w:eastAsia="Aptos" w:cs="Arial" w:asciiTheme="minorHAnsi" w:cstheme="minorBidi" w:eastAsiaTheme="minorHAnsi" w:hAnsiTheme="minorHAnsi"/>
+        <w:rFonts w:ascii="Aptos" w:hAnsi="Aptos" w:eastAsia="Aptos" w:cs="Arial" w:asciiTheme="minorHAnsi" w:hAnsiTheme="minorHAnsi" w:eastAsiaTheme="minorHAnsi" w:cstheme="minorBidi"/>
         <w:sz w:val="22"/>
         <w:szCs w:val="22"/>
         <w:lang w:val="en-CA" w:eastAsia="en-US" w:bidi="ar-SA"/>
@@ -2033,11 +2151,11 @@
     <w:pPr>
       <w:widowControl/>
       <w:bidi w:val="0"/>
-      <w:spacing w:lineRule="auto" w:line="259" w:before="0" w:after="160"/>
+      <w:spacing w:before="0" w:after="160" w:line="259" w:lineRule="auto"/>
       <w:jc w:val="left"/>
     </w:pPr>
     <w:rPr>
-      <w:rFonts w:ascii="Aptos" w:hAnsi="Aptos" w:eastAsia="Aptos" w:cs="Arial" w:asciiTheme="minorHAnsi" w:cstheme="minorBidi" w:eastAsiaTheme="minorHAnsi" w:hAnsiTheme="minorHAnsi"/>
+      <w:rFonts w:ascii="Aptos" w:hAnsi="Aptos" w:eastAsia="Aptos" w:cs="Arial" w:asciiTheme="minorHAnsi" w:hAnsiTheme="minorHAnsi" w:eastAsiaTheme="minorHAnsi" w:cstheme="minorBidi"/>
       <w:color w:val="auto"/>
       <w:kern w:val="0"/>
       <w:sz w:val="22"/>
@@ -2046,7 +2164,7 @@
     </w:rPr>
   </w:style>
   <w:style w:type="paragraph" w:styleId="Heading1">
-    <w:name w:val="Heading 1"/>
+    <w:name w:val="heading 1"/>
     <w:basedOn w:val="Normal"/>
     <w:next w:val="Normal"/>
     <w:link w:val="Heading1Char"/>
@@ -2060,14 +2178,14 @@
       <w:outlineLvl w:val="0"/>
     </w:pPr>
     <w:rPr>
-      <w:rFonts w:ascii="Aptos Display" w:hAnsi="Aptos Display" w:eastAsia="" w:cs="Times New Roman" w:asciiTheme="majorHAnsi" w:cstheme="majorBidi" w:eastAsiaTheme="majorEastAsia" w:hAnsiTheme="majorHAnsi"/>
-      <w:color w:themeColor="accent1" w:themeShade="bf" w:val="0F4761"/>
+      <w:rFonts w:ascii="Aptos Display" w:hAnsi="Aptos Display" w:eastAsia="" w:cs="Times New Roman" w:asciiTheme="majorHAnsi" w:hAnsiTheme="majorHAnsi" w:eastAsiaTheme="majorEastAsia" w:cstheme="majorBidi"/>
+      <w:color w:val="0F4761" w:themeColor="accent1" w:themeShade="bf"/>
       <w:sz w:val="40"/>
       <w:szCs w:val="40"/>
     </w:rPr>
   </w:style>
   <w:style w:type="paragraph" w:styleId="Heading2">
-    <w:name w:val="Heading 2"/>
+    <w:name w:val="heading 2"/>
     <w:basedOn w:val="Normal"/>
     <w:next w:val="Normal"/>
     <w:link w:val="Heading2Char"/>
@@ -2083,14 +2201,14 @@
       <w:outlineLvl w:val="1"/>
     </w:pPr>
     <w:rPr>
-      <w:rFonts w:ascii="Aptos Display" w:hAnsi="Aptos Display" w:eastAsia="" w:cs="Times New Roman" w:asciiTheme="majorHAnsi" w:cstheme="majorBidi" w:eastAsiaTheme="majorEastAsia" w:hAnsiTheme="majorHAnsi"/>
-      <w:color w:themeColor="accent1" w:themeShade="bf" w:val="0F4761"/>
+      <w:rFonts w:ascii="Aptos Display" w:hAnsi="Aptos Display" w:eastAsia="" w:cs="Times New Roman" w:asciiTheme="majorHAnsi" w:hAnsiTheme="majorHAnsi" w:eastAsiaTheme="majorEastAsia" w:cstheme="majorBidi"/>
+      <w:color w:val="0F4761" w:themeColor="accent1" w:themeShade="bf"/>
       <w:sz w:val="32"/>
       <w:szCs w:val="32"/>
     </w:rPr>
   </w:style>
   <w:style w:type="paragraph" w:styleId="Heading3">
-    <w:name w:val="Heading 3"/>
+    <w:name w:val="heading 3"/>
     <w:basedOn w:val="Normal"/>
     <w:next w:val="Normal"/>
     <w:link w:val="Heading3Char"/>
@@ -2106,14 +2224,14 @@
       <w:outlineLvl w:val="2"/>
     </w:pPr>
     <w:rPr>
-      <w:rFonts w:eastAsia="" w:cs="Times New Roman" w:cstheme="majorBidi" w:eastAsiaTheme="majorEastAsia"/>
-      <w:color w:themeColor="accent1" w:themeShade="bf" w:val="0F4761"/>
+      <w:rFonts w:eastAsia="" w:cs="Times New Roman" w:eastAsiaTheme="majorEastAsia" w:cstheme="majorBidi"/>
+      <w:color w:val="0F4761" w:themeColor="accent1" w:themeShade="bf"/>
       <w:sz w:val="28"/>
       <w:szCs w:val="28"/>
     </w:rPr>
   </w:style>
   <w:style w:type="paragraph" w:styleId="Heading4">
-    <w:name w:val="Heading 4"/>
+    <w:name w:val="heading 4"/>
     <w:basedOn w:val="Normal"/>
     <w:next w:val="Normal"/>
     <w:link w:val="Heading4Char"/>
@@ -2129,14 +2247,14 @@
       <w:outlineLvl w:val="3"/>
     </w:pPr>
     <w:rPr>
-      <w:rFonts w:eastAsia="" w:cs="Times New Roman" w:cstheme="majorBidi" w:eastAsiaTheme="majorEastAsia"/>
+      <w:rFonts w:eastAsia="" w:cs="Times New Roman" w:eastAsiaTheme="majorEastAsia" w:cstheme="majorBidi"/>
       <w:i/>
       <w:iCs/>
-      <w:color w:themeColor="accent1" w:themeShade="bf" w:val="0F4761"/>
+      <w:color w:val="0F4761" w:themeColor="accent1" w:themeShade="bf"/>
     </w:rPr>
   </w:style>
   <w:style w:type="paragraph" w:styleId="Heading5">
-    <w:name w:val="Heading 5"/>
+    <w:name w:val="heading 5"/>
     <w:basedOn w:val="Normal"/>
     <w:next w:val="Normal"/>
     <w:link w:val="Heading5Char"/>
@@ -2152,12 +2270,12 @@
       <w:outlineLvl w:val="4"/>
     </w:pPr>
     <w:rPr>
-      <w:rFonts w:eastAsia="" w:cs="Times New Roman" w:cstheme="majorBidi" w:eastAsiaTheme="majorEastAsia"/>
-      <w:color w:themeColor="accent1" w:themeShade="bf" w:val="0F4761"/>
+      <w:rFonts w:eastAsia="" w:cs="Times New Roman" w:eastAsiaTheme="majorEastAsia" w:cstheme="majorBidi"/>
+      <w:color w:val="0F4761" w:themeColor="accent1" w:themeShade="bf"/>
     </w:rPr>
   </w:style>
   <w:style w:type="paragraph" w:styleId="Heading6">
-    <w:name w:val="Heading 6"/>
+    <w:name w:val="heading 6"/>
     <w:basedOn w:val="Normal"/>
     <w:next w:val="Normal"/>
     <w:link w:val="Heading6Char"/>
@@ -2173,14 +2291,14 @@
       <w:outlineLvl w:val="5"/>
     </w:pPr>
     <w:rPr>
-      <w:rFonts w:eastAsia="" w:cs="Times New Roman" w:cstheme="majorBidi" w:eastAsiaTheme="majorEastAsia"/>
+      <w:rFonts w:eastAsia="" w:cs="Times New Roman" w:eastAsiaTheme="majorEastAsia" w:cstheme="majorBidi"/>
       <w:i/>
       <w:iCs/>
-      <w:color w:themeColor="text1" w:themeTint="a6" w:val="595959"/>
+      <w:color w:val="595959" w:themeColor="text1" w:themeTint="a6"/>
     </w:rPr>
   </w:style>
   <w:style w:type="paragraph" w:styleId="Heading7">
-    <w:name w:val="Heading 7"/>
+    <w:name w:val="heading 7"/>
     <w:basedOn w:val="Normal"/>
     <w:next w:val="Normal"/>
     <w:link w:val="Heading7Char"/>
@@ -2196,12 +2314,12 @@
       <w:outlineLvl w:val="6"/>
     </w:pPr>
     <w:rPr>
-      <w:rFonts w:eastAsia="" w:cs="Times New Roman" w:cstheme="majorBidi" w:eastAsiaTheme="majorEastAsia"/>
-      <w:color w:themeColor="text1" w:themeTint="a6" w:val="595959"/>
+      <w:rFonts w:eastAsia="" w:cs="Times New Roman" w:eastAsiaTheme="majorEastAsia" w:cstheme="majorBidi"/>
+      <w:color w:val="595959" w:themeColor="text1" w:themeTint="a6"/>
     </w:rPr>
   </w:style>
   <w:style w:type="paragraph" w:styleId="Heading8">
-    <w:name w:val="Heading 8"/>
+    <w:name w:val="heading 8"/>
     <w:basedOn w:val="Normal"/>
     <w:next w:val="Normal"/>
     <w:link w:val="Heading8Char"/>
@@ -2217,14 +2335,14 @@
       <w:outlineLvl w:val="7"/>
     </w:pPr>
     <w:rPr>
-      <w:rFonts w:eastAsia="" w:cs="Times New Roman" w:cstheme="majorBidi" w:eastAsiaTheme="majorEastAsia"/>
+      <w:rFonts w:eastAsia="" w:cs="Times New Roman" w:eastAsiaTheme="majorEastAsia" w:cstheme="majorBidi"/>
       <w:i/>
       <w:iCs/>
-      <w:color w:themeColor="text1" w:themeTint="d8" w:val="272727"/>
+      <w:color w:val="272727" w:themeColor="text1" w:themeTint="d8"/>
     </w:rPr>
   </w:style>
   <w:style w:type="paragraph" w:styleId="Heading9">
-    <w:name w:val="Heading 9"/>
+    <w:name w:val="heading 9"/>
     <w:basedOn w:val="Normal"/>
     <w:next w:val="Normal"/>
     <w:link w:val="Heading9Char"/>
@@ -2240,8 +2358,8 @@
       <w:outlineLvl w:val="8"/>
     </w:pPr>
     <w:rPr>
-      <w:rFonts w:eastAsia="" w:cs="Times New Roman" w:cstheme="majorBidi" w:eastAsiaTheme="majorEastAsia"/>
-      <w:color w:themeColor="text1" w:themeTint="d8" w:val="272727"/>
+      <w:rFonts w:eastAsia="" w:cs="Times New Roman" w:eastAsiaTheme="majorEastAsia" w:cstheme="majorBidi"/>
+      <w:color w:val="272727" w:themeColor="text1" w:themeTint="d8"/>
     </w:rPr>
   </w:style>
   <w:style w:type="character" w:styleId="DefaultParagraphFont" w:default="1">
@@ -2260,8 +2378,8 @@
     <w:qFormat/>
     <w:rsid w:val="00837274"/>
     <w:rPr>
-      <w:rFonts w:ascii="Aptos Display" w:hAnsi="Aptos Display" w:eastAsia="" w:cs="Times New Roman" w:asciiTheme="majorHAnsi" w:cstheme="majorBidi" w:eastAsiaTheme="majorEastAsia" w:hAnsiTheme="majorHAnsi"/>
-      <w:color w:themeColor="accent1" w:themeShade="bf" w:val="0F4761"/>
+      <w:rFonts w:ascii="Aptos Display" w:hAnsi="Aptos Display" w:eastAsia="" w:cs="Times New Roman" w:asciiTheme="majorHAnsi" w:hAnsiTheme="majorHAnsi" w:eastAsiaTheme="majorEastAsia" w:cstheme="majorBidi"/>
+      <w:color w:val="0F4761" w:themeColor="accent1" w:themeShade="bf"/>
       <w:sz w:val="40"/>
       <w:szCs w:val="40"/>
     </w:rPr>
@@ -2275,8 +2393,8 @@
     <w:qFormat/>
     <w:rsid w:val="00837274"/>
     <w:rPr>
-      <w:rFonts w:ascii="Aptos Display" w:hAnsi="Aptos Display" w:eastAsia="" w:cs="Times New Roman" w:asciiTheme="majorHAnsi" w:cstheme="majorBidi" w:eastAsiaTheme="majorEastAsia" w:hAnsiTheme="majorHAnsi"/>
-      <w:color w:themeColor="accent1" w:themeShade="bf" w:val="0F4761"/>
+      <w:rFonts w:ascii="Aptos Display" w:hAnsi="Aptos Display" w:eastAsia="" w:cs="Times New Roman" w:asciiTheme="majorHAnsi" w:hAnsiTheme="majorHAnsi" w:eastAsiaTheme="majorEastAsia" w:cstheme="majorBidi"/>
+      <w:color w:val="0F4761" w:themeColor="accent1" w:themeShade="bf"/>
       <w:sz w:val="32"/>
       <w:szCs w:val="32"/>
     </w:rPr>
@@ -2290,8 +2408,8 @@
     <w:qFormat/>
     <w:rsid w:val="00837274"/>
     <w:rPr>
-      <w:rFonts w:eastAsia="" w:cs="Times New Roman" w:cstheme="majorBidi" w:eastAsiaTheme="majorEastAsia"/>
-      <w:color w:themeColor="accent1" w:themeShade="bf" w:val="0F4761"/>
+      <w:rFonts w:eastAsia="" w:cs="Times New Roman" w:eastAsiaTheme="majorEastAsia" w:cstheme="majorBidi"/>
+      <w:color w:val="0F4761" w:themeColor="accent1" w:themeShade="bf"/>
       <w:sz w:val="28"/>
       <w:szCs w:val="28"/>
     </w:rPr>
@@ -2305,10 +2423,10 @@
     <w:qFormat/>
     <w:rsid w:val="00837274"/>
     <w:rPr>
-      <w:rFonts w:eastAsia="" w:cs="Times New Roman" w:cstheme="majorBidi" w:eastAsiaTheme="majorEastAsia"/>
+      <w:rFonts w:eastAsia="" w:cs="Times New Roman" w:eastAsiaTheme="majorEastAsia" w:cstheme="majorBidi"/>
       <w:i/>
       <w:iCs/>
-      <w:color w:themeColor="accent1" w:themeShade="bf" w:val="0F4761"/>
+      <w:color w:val="0F4761" w:themeColor="accent1" w:themeShade="bf"/>
     </w:rPr>
   </w:style>
   <w:style w:type="character" w:styleId="Heading5Char" w:customStyle="1">
@@ -2320,8 +2438,8 @@
     <w:qFormat/>
     <w:rsid w:val="00837274"/>
     <w:rPr>
-      <w:rFonts w:eastAsia="" w:cs="Times New Roman" w:cstheme="majorBidi" w:eastAsiaTheme="majorEastAsia"/>
-      <w:color w:themeColor="accent1" w:themeShade="bf" w:val="0F4761"/>
+      <w:rFonts w:eastAsia="" w:cs="Times New Roman" w:eastAsiaTheme="majorEastAsia" w:cstheme="majorBidi"/>
+      <w:color w:val="0F4761" w:themeColor="accent1" w:themeShade="bf"/>
     </w:rPr>
   </w:style>
   <w:style w:type="character" w:styleId="Heading6Char" w:customStyle="1">
@@ -2333,10 +2451,10 @@
     <w:qFormat/>
     <w:rsid w:val="00837274"/>
     <w:rPr>
-      <w:rFonts w:eastAsia="" w:cs="Times New Roman" w:cstheme="majorBidi" w:eastAsiaTheme="majorEastAsia"/>
+      <w:rFonts w:eastAsia="" w:cs="Times New Roman" w:eastAsiaTheme="majorEastAsia" w:cstheme="majorBidi"/>
       <w:i/>
       <w:iCs/>
-      <w:color w:themeColor="text1" w:themeTint="a6" w:val="595959"/>
+      <w:color w:val="595959" w:themeColor="text1" w:themeTint="a6"/>
     </w:rPr>
   </w:style>
   <w:style w:type="character" w:styleId="Heading7Char" w:customStyle="1">
@@ -2348,8 +2466,8 @@
     <w:qFormat/>
     <w:rsid w:val="00837274"/>
     <w:rPr>
-      <w:rFonts w:eastAsia="" w:cs="Times New Roman" w:cstheme="majorBidi" w:eastAsiaTheme="majorEastAsia"/>
-      <w:color w:themeColor="text1" w:themeTint="a6" w:val="595959"/>
+      <w:rFonts w:eastAsia="" w:cs="Times New Roman" w:eastAsiaTheme="majorEastAsia" w:cstheme="majorBidi"/>
+      <w:color w:val="595959" w:themeColor="text1" w:themeTint="a6"/>
     </w:rPr>
   </w:style>
   <w:style w:type="character" w:styleId="Heading8Char" w:customStyle="1">
@@ -2361,10 +2479,10 @@
     <w:qFormat/>
     <w:rsid w:val="00837274"/>
     <w:rPr>
-      <w:rFonts w:eastAsia="" w:cs="Times New Roman" w:cstheme="majorBidi" w:eastAsiaTheme="majorEastAsia"/>
+      <w:rFonts w:eastAsia="" w:cs="Times New Roman" w:eastAsiaTheme="majorEastAsia" w:cstheme="majorBidi"/>
       <w:i/>
       <w:iCs/>
-      <w:color w:themeColor="text1" w:themeTint="d8" w:val="272727"/>
+      <w:color w:val="272727" w:themeColor="text1" w:themeTint="d8"/>
     </w:rPr>
   </w:style>
   <w:style w:type="character" w:styleId="Heading9Char" w:customStyle="1">
@@ -2376,8 +2494,8 @@
     <w:qFormat/>
     <w:rsid w:val="00837274"/>
     <w:rPr>
-      <w:rFonts w:eastAsia="" w:cs="Times New Roman" w:cstheme="majorBidi" w:eastAsiaTheme="majorEastAsia"/>
-      <w:color w:themeColor="text1" w:themeTint="d8" w:val="272727"/>
+      <w:rFonts w:eastAsia="" w:cs="Times New Roman" w:eastAsiaTheme="majorEastAsia" w:cstheme="majorBidi"/>
+      <w:color w:val="272727" w:themeColor="text1" w:themeTint="d8"/>
     </w:rPr>
   </w:style>
   <w:style w:type="character" w:styleId="TitleChar" w:customStyle="1">
@@ -2388,7 +2506,7 @@
     <w:qFormat/>
     <w:rsid w:val="00837274"/>
     <w:rPr>
-      <w:rFonts w:ascii="Aptos Display" w:hAnsi="Aptos Display" w:eastAsia="" w:cs="Times New Roman" w:asciiTheme="majorHAnsi" w:cstheme="majorBidi" w:eastAsiaTheme="majorEastAsia" w:hAnsiTheme="majorHAnsi"/>
+      <w:rFonts w:ascii="Aptos Display" w:hAnsi="Aptos Display" w:eastAsia="" w:cs="Times New Roman" w:asciiTheme="majorHAnsi" w:hAnsiTheme="majorHAnsi" w:eastAsiaTheme="majorEastAsia" w:cstheme="majorBidi"/>
       <w:spacing w:val="-10"/>
       <w:kern w:val="2"/>
       <w:sz w:val="56"/>
@@ -2403,8 +2521,8 @@
     <w:qFormat/>
     <w:rsid w:val="00837274"/>
     <w:rPr>
-      <w:rFonts w:eastAsia="" w:cs="Times New Roman" w:cstheme="majorBidi" w:eastAsiaTheme="majorEastAsia"/>
-      <w:color w:themeColor="text1" w:themeTint="a6" w:val="595959"/>
+      <w:rFonts w:eastAsia="" w:cs="Times New Roman" w:eastAsiaTheme="majorEastAsia" w:cstheme="majorBidi"/>
+      <w:color w:val="595959" w:themeColor="text1" w:themeTint="a6"/>
       <w:spacing w:val="15"/>
       <w:sz w:val="28"/>
       <w:szCs w:val="28"/>
@@ -2420,7 +2538,7 @@
     <w:rPr>
       <w:i/>
       <w:iCs/>
-      <w:color w:themeColor="text1" w:themeTint="bf" w:val="404040"/>
+      <w:color w:val="404040" w:themeColor="text1" w:themeTint="bf"/>
     </w:rPr>
   </w:style>
   <w:style w:type="character" w:styleId="IntenseEmphasis">
@@ -2432,7 +2550,7 @@
     <w:rPr>
       <w:i/>
       <w:iCs/>
-      <w:color w:themeColor="accent1" w:themeShade="bf" w:val="0F4761"/>
+      <w:color w:val="0F4761" w:themeColor="accent1" w:themeShade="bf"/>
     </w:rPr>
   </w:style>
   <w:style w:type="character" w:styleId="IntenseQuoteChar" w:customStyle="1">
@@ -2445,7 +2563,7 @@
     <w:rPr>
       <w:i/>
       <w:iCs/>
-      <w:color w:themeColor="accent1" w:themeShade="bf" w:val="0F4761"/>
+      <w:color w:val="0F4761" w:themeColor="accent1" w:themeShade="bf"/>
     </w:rPr>
   </w:style>
   <w:style w:type="character" w:styleId="IntenseReference">
@@ -2458,7 +2576,7 @@
       <w:b/>
       <w:bCs/>
       <w:smallCaps/>
-      <w:color w:themeColor="accent1" w:themeShade="bf" w:val="0F4761"/>
+      <w:color w:val="0F4761" w:themeColor="accent1" w:themeShade="bf"/>
       <w:spacing w:val="5"/>
     </w:rPr>
   </w:style>
@@ -2481,7 +2599,7 @@
     <w:name w:val="Body Text"/>
     <w:basedOn w:val="Normal"/>
     <w:pPr>
-      <w:spacing w:lineRule="auto" w:line="276" w:before="0" w:after="140"/>
+      <w:spacing w:before="0" w:after="140" w:line="276" w:lineRule="auto"/>
     </w:pPr>
     <w:rPr/>
   </w:style>
@@ -2529,11 +2647,11 @@
     <w:qFormat/>
     <w:rsid w:val="00837274"/>
     <w:pPr>
-      <w:spacing w:lineRule="auto" w:line="240" w:before="0" w:after="80"/>
+      <w:spacing w:before="0" w:after="80" w:line="240" w:lineRule="auto"/>
       <w:contextualSpacing/>
     </w:pPr>
     <w:rPr>
-      <w:rFonts w:ascii="Aptos Display" w:hAnsi="Aptos Display" w:eastAsia="" w:cs="Times New Roman" w:asciiTheme="majorHAnsi" w:cstheme="majorBidi" w:eastAsiaTheme="majorEastAsia" w:hAnsiTheme="majorHAnsi"/>
+      <w:rFonts w:ascii="Aptos Display" w:hAnsi="Aptos Display" w:eastAsia="" w:cs="Times New Roman" w:asciiTheme="majorHAnsi" w:hAnsiTheme="majorHAnsi" w:eastAsiaTheme="majorEastAsia" w:cstheme="majorBidi"/>
       <w:spacing w:val="-10"/>
       <w:kern w:val="2"/>
       <w:sz w:val="56"/>
@@ -2550,8 +2668,8 @@
     <w:rsid w:val="00837274"/>
     <w:pPr/>
     <w:rPr>
-      <w:rFonts w:eastAsia="" w:cs="Times New Roman" w:cstheme="majorBidi" w:eastAsiaTheme="majorEastAsia"/>
-      <w:color w:themeColor="text1" w:themeTint="a6" w:val="595959"/>
+      <w:rFonts w:eastAsia="" w:cs="Times New Roman" w:eastAsiaTheme="majorEastAsia" w:cstheme="majorBidi"/>
+      <w:color w:val="595959" w:themeColor="text1" w:themeTint="a6"/>
       <w:spacing w:val="15"/>
       <w:sz w:val="28"/>
       <w:szCs w:val="28"/>
@@ -2572,7 +2690,7 @@
     <w:rPr>
       <w:i/>
       <w:iCs/>
-      <w:color w:themeColor="text1" w:themeTint="bf" w:val="404040"/>
+      <w:color w:val="404040" w:themeColor="text1" w:themeTint="bf"/>
     </w:rPr>
   </w:style>
   <w:style w:type="paragraph" w:styleId="ListParagraph">
@@ -2598,8 +2716,8 @@
     <w:rsid w:val="00837274"/>
     <w:pPr>
       <w:pBdr>
-        <w:top w:val="single" w:sz="4" w:space="10" w:color="0F4761" w:themeColor="accent1" w:themeShade="bf"/>
-        <w:bottom w:val="single" w:sz="4" w:space="10" w:color="0F4761" w:themeColor="accent1" w:themeShade="bf"/>
+        <w:top w:val="single" w:color="0F4761" w:themeColor="accent1" w:themeShade="bf" w:sz="4" w:space="10"/>
+        <w:bottom w:val="single" w:color="0F4761" w:themeColor="accent1" w:themeShade="bf" w:sz="4" w:space="10"/>
       </w:pBdr>
       <w:spacing w:before="360" w:after="360"/>
       <w:ind w:left="864" w:right="864"/>
@@ -2608,7 +2726,7 @@
     <w:rPr>
       <w:i/>
       <w:iCs/>
-      <w:color w:themeColor="accent1" w:themeShade="bf" w:val="0F4761"/>
+      <w:color w:val="0F4761" w:themeColor="accent1" w:themeShade="bf"/>
     </w:rPr>
   </w:style>
   <w:style w:type="numbering" w:styleId="NoList" w:default="1">
@@ -2618,7 +2736,7 @@
     <w:unhideWhenUsed/>
     <w:qFormat/>
   </w:style>
-  <w:style w:type="table" w:default="1" w:styleId="TableNormal">
+  <w:style w:type="table" w:styleId="TableNormal" w:default="1">
     <w:name w:val="Normal Table"/>
     <w:uiPriority w:val="99"/>
     <w:semiHidden/>

</xml_diff>